<commit_message>
Subida Plan de timepos
</commit_message>
<xml_diff>
--- a/Proyecto/PROMPTS FIGMA.docx
+++ b/Proyecto/PROMPTS FIGMA.docx
@@ -51,14 +51,7 @@
           <w:sz w:val="20"/>
           <w:szCs w:val="20"/>
         </w:rPr>
-        <w:t>Crea una nueva sección independiente llamada "Reservar Cita" dentro de la plataforma web GEAR EAGLE. Esta sección debe mantener exactamente el mismo estilo visual actual de la plataforma, incluyendo colores, tipografía, botones, espaciado e identidad visua</w:t>
-      </w:r>
-      <w:r>
-        <w:rPr>
-          <w:sz w:val="20"/>
-          <w:szCs w:val="20"/>
-        </w:rPr>
-        <w:t>l. Debe verse como una parte nativa del sistema.</w:t>
+        <w:t>Crea una nueva sección independiente llamada "Reservar Cita" dentro de la plataforma web GEAR EAGLE. Esta sección debe mantener exactamente el mismo estilo visual actual de la plataforma, incluyendo colores, tipografía, botones, espaciado e identidad visual. Debe verse como una parte nativa del sistema.</w:t>
       </w:r>
     </w:p>
     <w:p>
@@ -90,14 +83,7 @@
           <w:sz w:val="20"/>
           <w:szCs w:val="20"/>
         </w:rPr>
-        <w:t>Primero, si el usuario no está autenticado, mostrar un formulario de registro obligatorio con los siguiente</w:t>
-      </w:r>
-      <w:r>
-        <w:rPr>
-          <w:sz w:val="20"/>
-          <w:szCs w:val="20"/>
-        </w:rPr>
-        <w:t>s campos:</w:t>
+        <w:t>Primero, si el usuario no está autenticado, mostrar un formulario de registro obligatorio con los siguientes campos:</w:t>
       </w:r>
     </w:p>
     <w:p>
@@ -185,14 +171,7 @@
           <w:sz w:val="20"/>
           <w:szCs w:val="20"/>
         </w:rPr>
-        <w:t>Después del registro, o si el usuario ya está autenticado, mostrar el formula</w:t>
-      </w:r>
-      <w:r>
-        <w:rPr>
-          <w:sz w:val="20"/>
-          <w:szCs w:val="20"/>
-        </w:rPr>
-        <w:t>rio de agendamiento de cita con los siguientes campos:</w:t>
+        <w:t>Después del registro, o si el usuario ya está autenticado, mostrar el formulario de agendamiento de cita con los siguientes campos:</w:t>
       </w:r>
     </w:p>
     <w:p>
@@ -264,14 +243,7 @@
           <w:sz w:val="20"/>
           <w:szCs w:val="20"/>
         </w:rPr>
-        <w:t>Mostrar confirmación visual después de agendar</w:t>
-      </w:r>
-      <w:r>
-        <w:rPr>
-          <w:sz w:val="20"/>
-          <w:szCs w:val="20"/>
-        </w:rPr>
-        <w:t xml:space="preserve"> la cita.</w:t>
+        <w:t>Mostrar confirmación visual después de agendar la cita.</w:t>
       </w:r>
     </w:p>
     <w:p>
@@ -353,16 +325,7 @@
           <w:sz w:val="20"/>
           <w:szCs w:val="20"/>
         </w:rPr>
-        <w:t>_________________________</w:t>
-      </w:r>
-      <w:r>
-        <w:rPr>
-          <w:b/>
-          <w:bCs/>
-          <w:sz w:val="20"/>
-          <w:szCs w:val="20"/>
-        </w:rPr>
-        <w:t>______________________________________</w:t>
+        <w:t>_______________________________________________________________</w:t>
       </w:r>
       <w:r>
         <w:rPr>
@@ -477,14 +440,7 @@
           <w:sz w:val="20"/>
           <w:szCs w:val="20"/>
         </w:rPr>
-        <w:t xml:space="preserve"> ni diseño, solo agrega e</w:t>
-      </w:r>
-      <w:r>
-        <w:rPr>
-          <w:sz w:val="20"/>
-          <w:szCs w:val="20"/>
-        </w:rPr>
-        <w:t>sta nueva funcionalidad.</w:t>
+        <w:t xml:space="preserve"> ni diseño, solo agrega esta nueva funcionalidad.</w:t>
       </w:r>
     </w:p>
     <w:p>
@@ -581,14 +537,7 @@
           <w:sz w:val="20"/>
           <w:szCs w:val="20"/>
         </w:rPr>
-        <w:t xml:space="preserve">Este formulario debe usar el mismo estilo </w:t>
-      </w:r>
-      <w:r>
-        <w:rPr>
-          <w:sz w:val="20"/>
-          <w:szCs w:val="20"/>
-        </w:rPr>
-        <w:t>visual de formularios existente en la plataforma.</w:t>
+        <w:t>Este formulario debe usar el mismo estilo visual de formularios existente en la plataforma.</w:t>
       </w:r>
     </w:p>
     <w:p>
@@ -620,14 +569,7 @@
           <w:sz w:val="20"/>
           <w:szCs w:val="20"/>
         </w:rPr>
-        <w:t>Si el usuario no está registrado o no ha iniciado ses</w:t>
-      </w:r>
-      <w:r>
-        <w:rPr>
-          <w:sz w:val="20"/>
-          <w:szCs w:val="20"/>
-        </w:rPr>
-        <w:t>ión, debe mostrarse el formulario de registro antes de permitir reservar la cita.</w:t>
+        <w:t>Si el usuario no está registrado o no ha iniciado sesión, debe mostrarse el formulario de registro antes de permitir reservar la cita.</w:t>
       </w:r>
     </w:p>
     <w:p>
@@ -675,14 +617,7 @@
           <w:sz w:val="20"/>
           <w:szCs w:val="20"/>
         </w:rPr>
-        <w:t>Mantener el mismo estilo visual existe</w:t>
-      </w:r>
-      <w:r>
-        <w:rPr>
-          <w:sz w:val="20"/>
-          <w:szCs w:val="20"/>
-        </w:rPr>
-        <w:t>nte. No rediseñar la página, solo agregar estas secciones y modificar el formulario de reservar cita eliminando el campo de motocicleta.</w:t>
+        <w:t>Mantener el mismo estilo visual existente. No rediseñar la página, solo agregar estas secciones y modificar el formulario de reservar cita eliminando el campo de motocicleta.</w:t>
       </w:r>
     </w:p>
     <w:p>
@@ -742,14 +677,7 @@
           <w:sz w:val="20"/>
           <w:szCs w:val="20"/>
         </w:rPr>
-        <w:t>agregar un rectángulo con ra</w:t>
-      </w:r>
-      <w:r>
-        <w:rPr>
-          <w:sz w:val="20"/>
-          <w:szCs w:val="20"/>
-        </w:rPr>
-        <w:t xml:space="preserve">dio de 8px posicionado justo debajo del nombre "María Rodríguez". Este elemento llevará como etiqueta superior el texto </w:t>
+        <w:t xml:space="preserve">agregar un rectángulo con radio de 8px posicionado justo debajo del nombre "María Rodríguez". Este elemento llevará como etiqueta superior el texto </w:t>
       </w:r>
       <w:r>
         <w:rPr>
@@ -797,14 +725,7 @@
           <w:sz w:val="20"/>
           <w:szCs w:val="20"/>
         </w:rPr>
-        <w:t>, acompañado de un icono de lupa para facilitar</w:t>
-      </w:r>
-      <w:r>
-        <w:rPr>
-          <w:sz w:val="20"/>
-          <w:szCs w:val="20"/>
-        </w:rPr>
-        <w:t xml:space="preserve"> la identificación visual. Para dar dinamismo al prototipo mediante variantes, utiliza los textos </w:t>
+        <w:t xml:space="preserve">, acompañado de un icono de lupa para facilitar la identificación visual. Para dar dinamismo al prototipo mediante variantes, utiliza los textos </w:t>
       </w:r>
       <w:r>
         <w:rPr>
@@ -852,14 +773,7 @@
           <w:sz w:val="20"/>
           <w:szCs w:val="20"/>
         </w:rPr>
-        <w:t xml:space="preserve"> para errores de búsq</w:t>
-      </w:r>
-      <w:r>
-        <w:rPr>
-          <w:sz w:val="20"/>
-          <w:szCs w:val="20"/>
-        </w:rPr>
-        <w:t xml:space="preserve">ueda, y </w:t>
+        <w:t xml:space="preserve"> para errores de búsqueda, y </w:t>
       </w:r>
       <w:r>
         <w:rPr>
@@ -900,16 +814,7 @@
           <w:sz w:val="20"/>
           <w:szCs w:val="20"/>
         </w:rPr>
-        <w:t>"Ingresa los 6 caracteres de la placa para filtrar rápidamente tus motocicletas en servi</w:t>
-      </w:r>
-      <w:r>
-        <w:rPr>
-          <w:b/>
-          <w:bCs/>
-          <w:sz w:val="20"/>
-          <w:szCs w:val="20"/>
-        </w:rPr>
-        <w:t>cio"</w:t>
+        <w:t>"Ingresa los 6 caracteres de la placa para filtrar rápidamente tus motocicletas en servicio"</w:t>
       </w:r>
       <w:r>
         <w:rPr>
@@ -959,17 +864,7 @@
           <w:sz w:val="20"/>
           <w:szCs w:val="20"/>
         </w:rPr>
-        <w:t>Criterios de Aceptación: Módulo de Notific</w:t>
-      </w:r>
-      <w:r>
-        <w:rPr>
-          <w:b/>
-          <w:bCs/>
-          <w:color w:val="000000"/>
-          <w:sz w:val="20"/>
-          <w:szCs w:val="20"/>
-        </w:rPr>
-        <w:t>aciones</w:t>
+        <w:t>Criterios de Aceptación: Módulo de Notificaciones</w:t>
       </w:r>
     </w:p>
     <w:p>
@@ -1075,14 +970,7 @@
           <w:sz w:val="20"/>
           <w:szCs w:val="20"/>
         </w:rPr>
-        <w:t>: El sistema debe enviar la notificación a través del can</w:t>
-      </w:r>
-      <w:r>
-        <w:rPr>
-          <w:sz w:val="20"/>
-          <w:szCs w:val="20"/>
-        </w:rPr>
-        <w:t>al configurado (App, correo electrónico o SMS) y registrar en tiempo real si el estado es enviada, entregada o leída.</w:t>
+        <w:t>: El sistema debe enviar la notificación a través del canal configurado (App, correo electrónico o SMS) y registrar en tiempo real si el estado es enviada, entregada o leída.</w:t>
       </w:r>
     </w:p>
     <w:p>
@@ -1111,14 +999,7 @@
           <w:sz w:val="20"/>
           <w:szCs w:val="20"/>
         </w:rPr>
-        <w:t>: Antes de procesar cualquier envío, el sistema debe validar que el destinatario tenga permisos activos</w:t>
-      </w:r>
-      <w:r>
-        <w:rPr>
-          <w:sz w:val="20"/>
-          <w:szCs w:val="20"/>
-        </w:rPr>
-        <w:t xml:space="preserve"> y asegurar que no se envíen notificaciones duplicadas para un mismo evento.</w:t>
+        <w:t>: Antes de procesar cualquier envío, el sistema debe validar que el destinatario tenga permisos activos y asegurar que no se envíen notificaciones duplicadas para un mismo evento.</w:t>
       </w:r>
     </w:p>
     <w:p>
@@ -1147,14 +1028,7 @@
           <w:sz w:val="20"/>
           <w:szCs w:val="20"/>
         </w:rPr>
-        <w:t>: En caso de error en el envío, el sistema debe ejecutar reintentos automáticos según la política definida; si una notificación no es atendida en</w:t>
-      </w:r>
-      <w:r>
-        <w:rPr>
-          <w:sz w:val="20"/>
-          <w:szCs w:val="20"/>
-        </w:rPr>
-        <w:t xml:space="preserve"> el tiempo establecido, debe escalarse automáticamente al siguiente nivel jerárquico.</w:t>
+        <w:t>: En caso de error en el envío, el sistema debe ejecutar reintentos automáticos según la política definida; si una notificación no es atendida en el tiempo establecido, debe escalarse automáticamente al siguiente nivel jerárquico.</w:t>
       </w:r>
     </w:p>
     <w:p>
@@ -1183,14 +1057,7 @@
           <w:sz w:val="20"/>
           <w:szCs w:val="20"/>
         </w:rPr>
-        <w:t>: Todas las notificaciones deben quedar registradas en un log de auditoría que especifique quién recibió el mensaje, cuándo se envió, qué evento l</w:t>
-      </w:r>
-      <w:r>
-        <w:rPr>
-          <w:sz w:val="20"/>
-          <w:szCs w:val="20"/>
-        </w:rPr>
-        <w:t>o disparó y el resultado final del envío.</w:t>
+        <w:t>: Todas las notificaciones deben quedar registradas en un log de auditoría que especifique quién recibió el mensaje, cuándo se envió, qué evento lo disparó y el resultado final del envío.</w:t>
       </w:r>
     </w:p>
     <w:p>
@@ -1220,14 +1087,7 @@
           <w:sz w:val="20"/>
           <w:szCs w:val="20"/>
         </w:rPr>
-        <w:t>: El sistema debe identificar automáticamente al destinatario (mecánico, supervisor, cliente o administrador) basándose en reglas de asignación vinculadas al tipo de evento dete</w:t>
-      </w:r>
-      <w:r>
-        <w:rPr>
-          <w:sz w:val="20"/>
-          <w:szCs w:val="20"/>
-        </w:rPr>
-        <w:t>ctado.</w:t>
+        <w:t>: El sistema debe identificar automáticamente al destinatario (mecánico, supervisor, cliente o administrador) basándose en reglas de asignación vinculadas al tipo de evento detectado.</w:t>
       </w:r>
     </w:p>
     <w:p>
@@ -1361,16 +1221,7 @@
           <w:sz w:val="20"/>
           <w:szCs w:val="20"/>
         </w:rPr>
-        <w:t>2</w:t>
-      </w:r>
-      <w:r>
-        <w:rPr>
-          <w:b/>
-          <w:bCs/>
-          <w:sz w:val="20"/>
-          <w:szCs w:val="20"/>
-        </w:rPr>
-        <w:t>. Detalles del Servicio:</w:t>
+        <w:t>2. Detalles del Servicio:</w:t>
       </w:r>
     </w:p>
     <w:p>
@@ -1592,16 +1443,7 @@
           <w:sz w:val="20"/>
           <w:szCs w:val="20"/>
         </w:rPr>
-        <w:t>4. Opciones Adicionales (E</w:t>
-      </w:r>
-      <w:r>
-        <w:rPr>
-          <w:b/>
-          <w:bCs/>
-          <w:sz w:val="20"/>
-          <w:szCs w:val="20"/>
-        </w:rPr>
-        <w:t>l "Plus"):</w:t>
+        <w:t>4. Opciones Adicionales (El "Plus"):</w:t>
       </w:r>
     </w:p>
     <w:p>
@@ -1691,14 +1533,7 @@
           <w:sz w:val="20"/>
           <w:szCs w:val="20"/>
         </w:rPr>
-        <w:t xml:space="preserve"> Cu</w:t>
-      </w:r>
-      <w:r>
-        <w:rPr>
-          <w:sz w:val="20"/>
-          <w:szCs w:val="20"/>
-        </w:rPr>
-        <w:t xml:space="preserve">ando el usuario haga clic en </w:t>
+        <w:t xml:space="preserve"> Cuando el usuario haga clic en </w:t>
       </w:r>
       <w:r>
         <w:rPr>
@@ -1935,14 +1770,7 @@
           <w:sz w:val="20"/>
           <w:szCs w:val="20"/>
         </w:rPr>
-        <w:t>Amplía el apartado de Catálogo de Repuestos, ya que actua</w:t>
-      </w:r>
-      <w:r>
-        <w:rPr>
-          <w:sz w:val="20"/>
-          <w:szCs w:val="20"/>
-        </w:rPr>
-        <w:t>lmente tiene muy pocos productos.</w:t>
+        <w:t>Amplía el apartado de Catálogo de Repuestos, ya que actualmente tiene muy pocos productos.</w:t>
       </w:r>
     </w:p>
     <w:p>
@@ -1999,14 +1827,7 @@
           <w:sz w:val="20"/>
           <w:szCs w:val="20"/>
         </w:rPr>
-        <w:t>1. Agregar Sección: Marca de</w:t>
-      </w:r>
-      <w:r>
-        <w:rPr>
-          <w:sz w:val="20"/>
-          <w:szCs w:val="20"/>
-        </w:rPr>
-        <w:t xml:space="preserve"> Moto</w:t>
+        <w:t>1. Agregar Sección: Marca de Moto</w:t>
       </w:r>
     </w:p>
     <w:p>
@@ -2135,14 +1956,7 @@
           <w:sz w:val="20"/>
           <w:szCs w:val="20"/>
         </w:rPr>
-        <w:t>: Motul, Castrol, Reps</w:t>
-      </w:r>
-      <w:r>
-        <w:rPr>
-          <w:sz w:val="20"/>
-          <w:szCs w:val="20"/>
-        </w:rPr>
-        <w:t>ol)</w:t>
+        <w:t>: Motul, Castrol, Repsol)</w:t>
       </w:r>
     </w:p>
     <w:p>
@@ -2231,14 +2045,7 @@
           <w:sz w:val="20"/>
           <w:szCs w:val="20"/>
         </w:rPr>
-        <w:t>Kit de arrastre, Cadenas, Piñones, Bu</w:t>
-      </w:r>
-      <w:r>
-        <w:rPr>
-          <w:sz w:val="20"/>
-          <w:szCs w:val="20"/>
-        </w:rPr>
-        <w:t xml:space="preserve">jías, Filtros de aire, Filtros de aceite, Cables de </w:t>
+        <w:t xml:space="preserve">Kit de arrastre, Cadenas, Piñones, Bujías, Filtros de aire, Filtros de aceite, Cables de </w:t>
       </w:r>
       <w:proofErr w:type="spellStart"/>
       <w:r>
@@ -2318,14 +2125,7 @@
           <w:sz w:val="20"/>
           <w:szCs w:val="20"/>
         </w:rPr>
-        <w:t>Crear u</w:t>
-      </w:r>
-      <w:r>
-        <w:rPr>
-          <w:sz w:val="20"/>
-          <w:szCs w:val="20"/>
-        </w:rPr>
-        <w:t>na sección independiente llamada Accesorios, incluyendo:</w:t>
+        <w:t>Crear una sección independiente llamada Accesorios, incluyendo:</w:t>
       </w:r>
     </w:p>
     <w:p>
@@ -2373,14 +2173,7 @@
           <w:sz w:val="20"/>
           <w:szCs w:val="20"/>
         </w:rPr>
-        <w:t>Todos los preci</w:t>
-      </w:r>
-      <w:r>
-        <w:rPr>
-          <w:sz w:val="20"/>
-          <w:szCs w:val="20"/>
-        </w:rPr>
-        <w:t>os deben estar en pesos colombianos (COP).</w:t>
+        <w:t>Todos los precios deben estar en pesos colombianos (COP).</w:t>
       </w:r>
     </w:p>
     <w:p>
@@ -2444,14 +2237,7 @@
           <w:sz w:val="20"/>
           <w:szCs w:val="20"/>
         </w:rPr>
-        <w:t>Hacerlo realista, comple</w:t>
-      </w:r>
-      <w:r>
-        <w:rPr>
-          <w:sz w:val="20"/>
-          <w:szCs w:val="20"/>
-        </w:rPr>
-        <w:t>to y profesional.</w:t>
+        <w:t>Hacerlo realista, completo y profesional.</w:t>
       </w:r>
     </w:p>
     <w:p>
@@ -2555,14 +2341,7 @@
           <w:sz w:val="20"/>
           <w:szCs w:val="20"/>
         </w:rPr>
-        <w:t>Transforma el sistema de acceso de la plataforma GEAR EAGLE para que el registro y el inicio de sesión estén organizados de forma más clara, como en un</w:t>
-      </w:r>
-      <w:r>
-        <w:rPr>
-          <w:sz w:val="20"/>
-          <w:szCs w:val="20"/>
-        </w:rPr>
-        <w:t>a página web estándar. No cambies el diseño visual actual, solo reorganiza la funcionalidad manteniendo los mismos colores, tipografía y estilo.</w:t>
+        <w:t>Transforma el sistema de acceso de la plataforma GEAR EAGLE para que el registro y el inicio de sesión estén organizados de forma más clara, como en una página web estándar. No cambies el diseño visual actual, solo reorganiza la funcionalidad manteniendo los mismos colores, tipografía y estilo.</w:t>
       </w:r>
     </w:p>
     <w:p>
@@ -2595,14 +2374,7 @@
           <w:szCs w:val="20"/>
         </w:rPr>
         <w:lastRenderedPageBreak/>
-        <w:t>Crea una única página de acceso donde estén tanto “Iniciar sesión” como “Registrarse”. Esta página debe tener dos opciones claras: una sección para iniciar sesión y otra para registrarse, p</w:t>
-      </w:r>
-      <w:r>
-        <w:rPr>
-          <w:sz w:val="20"/>
-          <w:szCs w:val="20"/>
-        </w:rPr>
-        <w:t xml:space="preserve">ermitiendo cambiar entre ambas fácilmente (por </w:t>
+        <w:t xml:space="preserve">Crea una única página de acceso donde estén tanto “Iniciar sesión” como “Registrarse”. Esta página debe tener dos opciones claras: una sección para iniciar sesión y otra para registrarse, permitiendo cambiar entre ambas fácilmente (por </w:t>
       </w:r>
       <w:proofErr w:type="gramStart"/>
       <w:r>
@@ -2634,14 +2406,7 @@
           <w:sz w:val="20"/>
           <w:szCs w:val="20"/>
         </w:rPr>
-        <w:t>El formulario de registro debe incluir los campos normales: nombre, apellidos, correo electrónico, número telefónico, contraseña y con</w:t>
-      </w:r>
-      <w:r>
-        <w:rPr>
-          <w:sz w:val="20"/>
-          <w:szCs w:val="20"/>
-        </w:rPr>
-        <w:t>firmar contraseña.</w:t>
+        <w:t>El formulario de registro debe incluir los campos normales: nombre, apellidos, correo electrónico, número telefónico, contraseña y confirmar contraseña.</w:t>
       </w:r>
     </w:p>
     <w:p>
@@ -2689,14 +2454,7 @@
           <w:sz w:val="20"/>
           <w:szCs w:val="20"/>
         </w:rPr>
-        <w:t>Además, mejora la visibilidad del botón “Consultar mi servicio” en la página principal p</w:t>
-      </w:r>
-      <w:r>
-        <w:rPr>
-          <w:sz w:val="20"/>
-          <w:szCs w:val="20"/>
-        </w:rPr>
-        <w:t xml:space="preserve">ara que sea más llamativo y fácil de encontrar, manteniendo el mismo estilo visual </w:t>
+        <w:t xml:space="preserve">Además, mejora la visibilidad del botón “Consultar mi servicio” en la página principal para que sea más llamativo y fácil de encontrar, manteniendo el mismo estilo visual </w:t>
       </w:r>
       <w:proofErr w:type="gramStart"/>
       <w:r>
@@ -2728,14 +2486,7 @@
           <w:sz w:val="20"/>
           <w:szCs w:val="20"/>
         </w:rPr>
-        <w:t>No rediseñar la página completa, solo reorganizar el acceso al sistema y mejorar la visibilidad del botón indi</w:t>
-      </w:r>
-      <w:r>
-        <w:rPr>
-          <w:sz w:val="20"/>
-          <w:szCs w:val="20"/>
-        </w:rPr>
-        <w:t>cado.</w:t>
+        <w:t>No rediseñar la página completa, solo reorganizar el acceso al sistema y mejorar la visibilidad del botón indicado.</w:t>
       </w:r>
     </w:p>
     <w:p>
@@ -2793,14 +2544,7 @@
           <w:sz w:val="20"/>
           <w:szCs w:val="20"/>
         </w:rPr>
-        <w:t xml:space="preserve">Agrega un sistema de calificación para el taller y para los mecánicos dentro de la plataforma web GEAR EAGLE. No modificar el diseño visual actual, solo agregar esta </w:t>
-      </w:r>
-      <w:r>
-        <w:rPr>
-          <w:sz w:val="20"/>
-          <w:szCs w:val="20"/>
-        </w:rPr>
-        <w:t>funcionalidad manteniendo el mismo estilo, colores y tipografía del sistema.</w:t>
+        <w:t>Agrega un sistema de calificación para el taller y para los mecánicos dentro de la plataforma web GEAR EAGLE. No modificar el diseño visual actual, solo agregar esta funcionalidad manteniendo el mismo estilo, colores y tipografía del sistema.</w:t>
       </w:r>
     </w:p>
     <w:p>
@@ -2816,14 +2560,7 @@
           <w:sz w:val="20"/>
           <w:szCs w:val="20"/>
         </w:rPr>
-        <w:t xml:space="preserve">El sistema de calificación debe funcionar al finalizar un servicio o mantenimiento. Cuando un cliente termine su servicio, debe aparecer una opción para calificar tanto al taller </w:t>
-      </w:r>
-      <w:r>
-        <w:rPr>
-          <w:sz w:val="20"/>
-          <w:szCs w:val="20"/>
-        </w:rPr>
-        <w:t>como al mecánico que realizó el trabajo.</w:t>
+        <w:t>El sistema de calificación debe funcionar al finalizar un servicio o mantenimiento. Cuando un cliente termine su servicio, debe aparecer una opción para calificar tanto al taller como al mecánico que realizó el trabajo.</w:t>
       </w:r>
     </w:p>
     <w:p>
@@ -2895,14 +2632,7 @@
           <w:sz w:val="20"/>
           <w:szCs w:val="20"/>
         </w:rPr>
-        <w:t>Si el cliente da una c</w:t>
-      </w:r>
-      <w:r>
-        <w:rPr>
-          <w:sz w:val="20"/>
-          <w:szCs w:val="20"/>
-        </w:rPr>
-        <w:t>alificación de 4 estrellas o menos, debe aparecer opcionalmente un campo de comentario para que el cliente pueda escribir una observación o sugerencia. Este comentario no debe ser obligatorio.</w:t>
+        <w:t>Si el cliente da una calificación de 4 estrellas o menos, debe aparecer opcionalmente un campo de comentario para que el cliente pueda escribir una observación o sugerencia. Este comentario no debe ser obligatorio.</w:t>
       </w:r>
     </w:p>
     <w:p>
@@ -2934,14 +2664,7 @@
           <w:sz w:val="20"/>
           <w:szCs w:val="20"/>
         </w:rPr>
-        <w:t>D</w:t>
-      </w:r>
-      <w:r>
-        <w:rPr>
-          <w:sz w:val="20"/>
-          <w:szCs w:val="20"/>
-        </w:rPr>
-        <w:t>espués de enviar la calificación, el sistema debe guardar:</w:t>
+        <w:t>Después de enviar la calificación, el sistema debe guardar:</w:t>
       </w:r>
     </w:p>
     <w:p>
@@ -2989,14 +2712,7 @@
           <w:sz w:val="20"/>
           <w:szCs w:val="20"/>
         </w:rPr>
-        <w:t>Crear un nuevo apartado en el panel del Administrador llamado “Calificaciones y Opin</w:t>
-      </w:r>
-      <w:r>
-        <w:rPr>
-          <w:sz w:val="20"/>
-          <w:szCs w:val="20"/>
-        </w:rPr>
-        <w:t>iones”.</w:t>
+        <w:t>Crear un nuevo apartado en el panel del Administrador llamado “Calificaciones y Opiniones”.</w:t>
       </w:r>
     </w:p>
     <w:p>
@@ -3069,14 +2785,7 @@
           <w:szCs w:val="20"/>
         </w:rPr>
         <w:lastRenderedPageBreak/>
-        <w:t>Las calificaciones deben mostrarse también en</w:t>
-      </w:r>
-      <w:r>
-        <w:rPr>
-          <w:sz w:val="20"/>
-          <w:szCs w:val="20"/>
-        </w:rPr>
-        <w:t xml:space="preserve"> forma de estrellas y promedio numérico (por ejemplo 4.6 / 5).</w:t>
+        <w:t>Las calificaciones deben mostrarse también en forma de estrellas y promedio numérico (por ejemplo 4.6 / 5).</w:t>
       </w:r>
     </w:p>
     <w:p>
@@ -3112,16 +2821,7 @@
           <w:sz w:val="20"/>
           <w:szCs w:val="20"/>
         </w:rPr>
-        <w:t>_______________________________________</w:t>
-      </w:r>
-      <w:r>
-        <w:rPr>
-          <w:b/>
-          <w:bCs/>
-          <w:sz w:val="20"/>
-          <w:szCs w:val="20"/>
-        </w:rPr>
-        <w:t>________________________</w:t>
+        <w:t>_______________________________________________________________</w:t>
       </w:r>
     </w:p>
     <w:p>
@@ -3162,15 +2862,7 @@
           <w:sz w:val="20"/>
           <w:szCs w:val="20"/>
         </w:rPr>
-        <w:t>Diseña la pantalla de "Facturación" para el Administrador dentro de la plataforma web GEAR EAGLE, manteniendo exactamente el mismo estilo visual actual de la plataforma. Usa los mismos colores, tipografía, componentes, espa</w:t>
-      </w:r>
-      <w:r>
-        <w:rPr>
-          <w:color w:val="000000"/>
-          <w:sz w:val="20"/>
-          <w:szCs w:val="20"/>
-        </w:rPr>
-        <w:t>ciado y diseño. No crear un estilo nuevo, debe verse como una sección nativa del sistema existente.</w:t>
+        <w:t>Diseña la pantalla de "Facturación" para el Administrador dentro de la plataforma web GEAR EAGLE, manteniendo exactamente el mismo estilo visual actual de la plataforma. Usa los mismos colores, tipografía, componentes, espaciado y diseño. No crear un estilo nuevo, debe verse como una sección nativa del sistema existente.</w:t>
       </w:r>
     </w:p>
     <w:p>
@@ -3191,15 +2883,7 @@
           <w:sz w:val="20"/>
           <w:szCs w:val="20"/>
         </w:rPr>
-        <w:t>La pantalla debe representar el cierre económico de una orden de servicio y permitir al administrador visualizar, verificar y finalizar el proceso de factur</w:t>
-      </w:r>
-      <w:r>
-        <w:rPr>
-          <w:color w:val="000000"/>
-          <w:sz w:val="20"/>
-          <w:szCs w:val="20"/>
-        </w:rPr>
-        <w:t>ación.</w:t>
+        <w:t>La pantalla debe representar el cierre económico de una orden de servicio y permitir al administrador visualizar, verificar y finalizar el proceso de facturación.</w:t>
       </w:r>
     </w:p>
     <w:p>
@@ -3814,15 +3498,7 @@
           <w:sz w:val="20"/>
           <w:szCs w:val="20"/>
         </w:rPr>
-        <w:t xml:space="preserve"> administrativo, con buena j</w:t>
-      </w:r>
-      <w:r>
-        <w:rPr>
-          <w:color w:val="000000"/>
-          <w:sz w:val="20"/>
-          <w:szCs w:val="20"/>
-        </w:rPr>
-        <w:t>erarquía visual, espaciado limpio y apariencia profesional.</w:t>
+        <w:t xml:space="preserve"> administrativo, con buena jerarquía visual, espaciado limpio y apariencia profesional.</w:t>
       </w:r>
     </w:p>
     <w:p>
@@ -3910,34 +3586,51 @@
           <w:sz w:val="20"/>
           <w:szCs w:val="20"/>
         </w:rPr>
-        <w:t xml:space="preserve"> para: Nuevo Servicio (Apertura de </w:t>
+        <w:t xml:space="preserve"> para: Nuevo Servicio (Apertura de Orden)</w:t>
+      </w:r>
+    </w:p>
+    <w:p>
+      <w:pPr>
+        <w:spacing w:before="240" w:after="240"/>
+        <w:rPr>
+          <w:sz w:val="20"/>
+          <w:szCs w:val="20"/>
+        </w:rPr>
+      </w:pPr>
+      <w:r>
+        <w:rPr>
+          <w:sz w:val="20"/>
+          <w:szCs w:val="20"/>
+        </w:rPr>
+        <w:t xml:space="preserve">Este se basa principalmente en el </w:t>
       </w:r>
       <w:r>
         <w:rPr>
           <w:b/>
           <w:bCs/>
-          <w:color w:val="000000"/>
-          <w:sz w:val="20"/>
-          <w:szCs w:val="20"/>
-        </w:rPr>
-        <w:t>Orden)</w:t>
+          <w:sz w:val="20"/>
+          <w:szCs w:val="20"/>
+        </w:rPr>
+        <w:t>Módulo 4 (RF-15, RF-16)</w:t>
+      </w:r>
+      <w:r>
+        <w:rPr>
+          <w:sz w:val="20"/>
+          <w:szCs w:val="20"/>
+        </w:rPr>
+        <w:t>.</w:t>
       </w:r>
     </w:p>
     <w:p>
       <w:pPr>
         <w:spacing w:before="240" w:after="240"/>
-        <w:rPr>
-          <w:sz w:val="20"/>
-          <w:szCs w:val="20"/>
-        </w:rPr>
-      </w:pPr>
-      <w:r>
-        <w:rPr>
-          <w:sz w:val="20"/>
-          <w:szCs w:val="20"/>
-        </w:rPr>
-        <w:t xml:space="preserve">Este se basa principalmente en el </w:t>
-      </w:r>
+        <w:ind w:left="600" w:right="600"/>
+        <w:rPr>
+          <w:sz w:val="20"/>
+          <w:szCs w:val="20"/>
+        </w:rPr>
+      </w:pPr>
+      <w:proofErr w:type="spellStart"/>
       <w:r>
         <w:rPr>
           <w:b/>
@@ -3945,26 +3638,9 @@
           <w:sz w:val="20"/>
           <w:szCs w:val="20"/>
         </w:rPr>
-        <w:t>Módulo 4 (RF-15, RF-16)</w:t>
-      </w:r>
-      <w:r>
-        <w:rPr>
-          <w:sz w:val="20"/>
-          <w:szCs w:val="20"/>
-        </w:rPr>
-        <w:t>.</w:t>
-      </w:r>
-    </w:p>
-    <w:p>
-      <w:pPr>
-        <w:spacing w:before="240" w:after="240"/>
-        <w:ind w:left="600" w:right="600"/>
-        <w:rPr>
-          <w:sz w:val="20"/>
-          <w:szCs w:val="20"/>
-        </w:rPr>
-      </w:pPr>
-      <w:proofErr w:type="spellStart"/>
+        <w:t>Prompt</w:t>
+      </w:r>
+      <w:proofErr w:type="spellEnd"/>
       <w:r>
         <w:rPr>
           <w:b/>
@@ -3972,9 +3648,15 @@
           <w:sz w:val="20"/>
           <w:szCs w:val="20"/>
         </w:rPr>
-        <w:t>Prompt</w:t>
-      </w:r>
-      <w:proofErr w:type="spellEnd"/>
+        <w:t>:</w:t>
+      </w:r>
+      <w:r>
+        <w:rPr>
+          <w:sz w:val="20"/>
+          <w:szCs w:val="20"/>
+        </w:rPr>
+        <w:t xml:space="preserve"> "Generar una nueva </w:t>
+      </w:r>
       <w:r>
         <w:rPr>
           <w:b/>
@@ -3982,14 +3664,14 @@
           <w:sz w:val="20"/>
           <w:szCs w:val="20"/>
         </w:rPr>
-        <w:t>:</w:t>
-      </w:r>
-      <w:r>
-        <w:rPr>
-          <w:sz w:val="20"/>
-          <w:szCs w:val="20"/>
-        </w:rPr>
-        <w:t xml:space="preserve"> "Generar una nueva </w:t>
+        <w:t>Orden de Servicio</w:t>
+      </w:r>
+      <w:r>
+        <w:rPr>
+          <w:sz w:val="20"/>
+          <w:szCs w:val="20"/>
+        </w:rPr>
+        <w:t xml:space="preserve"> siguiendo el </w:t>
       </w:r>
       <w:r>
         <w:rPr>
@@ -3998,14 +3680,14 @@
           <w:sz w:val="20"/>
           <w:szCs w:val="20"/>
         </w:rPr>
-        <w:t>Orden de Servicio</w:t>
-      </w:r>
-      <w:r>
-        <w:rPr>
-          <w:sz w:val="20"/>
-          <w:szCs w:val="20"/>
-        </w:rPr>
-        <w:t xml:space="preserve"> siguiendo el </w:t>
+        <w:t>RF-15</w:t>
+      </w:r>
+      <w:r>
+        <w:rPr>
+          <w:sz w:val="20"/>
+          <w:szCs w:val="20"/>
+        </w:rPr>
+        <w:t xml:space="preserve">. * </w:t>
       </w:r>
       <w:r>
         <w:rPr>
@@ -4014,14 +3696,14 @@
           <w:sz w:val="20"/>
           <w:szCs w:val="20"/>
         </w:rPr>
-        <w:t>RF-15</w:t>
-      </w:r>
-      <w:r>
-        <w:rPr>
-          <w:sz w:val="20"/>
-          <w:szCs w:val="20"/>
-        </w:rPr>
-        <w:t xml:space="preserve">. * </w:t>
+        <w:t>Entrada obligatoria:</w:t>
+      </w:r>
+      <w:r>
+        <w:rPr>
+          <w:sz w:val="20"/>
+          <w:szCs w:val="20"/>
+        </w:rPr>
+        <w:t xml:space="preserve"> Solicitar la </w:t>
       </w:r>
       <w:r>
         <w:rPr>
@@ -4030,14 +3712,14 @@
           <w:sz w:val="20"/>
           <w:szCs w:val="20"/>
         </w:rPr>
-        <w:t>Entrada obligatoria:</w:t>
-      </w:r>
-      <w:r>
-        <w:rPr>
-          <w:sz w:val="20"/>
-          <w:szCs w:val="20"/>
-        </w:rPr>
-        <w:t xml:space="preserve"> Solicitar la </w:t>
+        <w:t>Placa</w:t>
+      </w:r>
+      <w:r>
+        <w:rPr>
+          <w:sz w:val="20"/>
+          <w:szCs w:val="20"/>
+        </w:rPr>
+        <w:t xml:space="preserve"> del vehículo para vincular la orden. * </w:t>
       </w:r>
       <w:r>
         <w:rPr>
@@ -4046,14 +3728,14 @@
           <w:sz w:val="20"/>
           <w:szCs w:val="20"/>
         </w:rPr>
-        <w:t>Placa</w:t>
-      </w:r>
-      <w:r>
-        <w:rPr>
-          <w:sz w:val="20"/>
-          <w:szCs w:val="20"/>
-        </w:rPr>
-        <w:t xml:space="preserve"> del vehículo para vincular la orden. * </w:t>
+        <w:t>Datos de recepción:</w:t>
+      </w:r>
+      <w:r>
+        <w:rPr>
+          <w:sz w:val="20"/>
+          <w:szCs w:val="20"/>
+        </w:rPr>
+        <w:t xml:space="preserve"> Registrar el estado físico inicial de la moto y el motivo de ingreso reportado por el cliente. * </w:t>
       </w:r>
       <w:r>
         <w:rPr>
@@ -4062,21 +3744,14 @@
           <w:sz w:val="20"/>
           <w:szCs w:val="20"/>
         </w:rPr>
-        <w:t>Datos de recepción:</w:t>
-      </w:r>
-      <w:r>
-        <w:rPr>
-          <w:sz w:val="20"/>
-          <w:szCs w:val="20"/>
-        </w:rPr>
-        <w:t xml:space="preserve"> Registrar el estado físi</w:t>
-      </w:r>
-      <w:r>
-        <w:rPr>
-          <w:sz w:val="20"/>
-          <w:szCs w:val="20"/>
-        </w:rPr>
-        <w:t xml:space="preserve">co inicial de la moto y el motivo de ingreso reportado por el cliente. * </w:t>
+        <w:t>Sección de Diagnóstico:</w:t>
+      </w:r>
+      <w:r>
+        <w:rPr>
+          <w:sz w:val="20"/>
+          <w:szCs w:val="20"/>
+        </w:rPr>
+        <w:t xml:space="preserve"> Habilitar un campo de texto detallado para que el mecánico redacte el diagnóstico técnico inicial (</w:t>
       </w:r>
       <w:r>
         <w:rPr>
@@ -4085,14 +3760,14 @@
           <w:sz w:val="20"/>
           <w:szCs w:val="20"/>
         </w:rPr>
-        <w:t>Sección de Diagnóstico:</w:t>
-      </w:r>
-      <w:r>
-        <w:rPr>
-          <w:sz w:val="20"/>
-          <w:szCs w:val="20"/>
-        </w:rPr>
-        <w:t xml:space="preserve"> Habilitar un campo de texto detallado para que el mecánico redacte el diagnóstico técnico inicial (</w:t>
+        <w:t>RF-16</w:t>
+      </w:r>
+      <w:r>
+        <w:rPr>
+          <w:sz w:val="20"/>
+          <w:szCs w:val="20"/>
+        </w:rPr>
+        <w:t xml:space="preserve">). * </w:t>
       </w:r>
       <w:r>
         <w:rPr>
@@ -4101,22 +3776,6 @@
           <w:sz w:val="20"/>
           <w:szCs w:val="20"/>
         </w:rPr>
-        <w:t>RF-16</w:t>
-      </w:r>
-      <w:r>
-        <w:rPr>
-          <w:sz w:val="20"/>
-          <w:szCs w:val="20"/>
-        </w:rPr>
-        <w:t xml:space="preserve">). * </w:t>
-      </w:r>
-      <w:r>
-        <w:rPr>
-          <w:b/>
-          <w:bCs/>
-          <w:sz w:val="20"/>
-          <w:szCs w:val="20"/>
-        </w:rPr>
         <w:t>Estado inicial:</w:t>
       </w:r>
       <w:r>
@@ -4124,14 +3783,7 @@
           <w:sz w:val="20"/>
           <w:szCs w:val="20"/>
         </w:rPr>
-        <w:t xml:space="preserve"> La orden debe iniciar automáticame</w:t>
-      </w:r>
-      <w:r>
-        <w:rPr>
-          <w:sz w:val="20"/>
-          <w:szCs w:val="20"/>
-        </w:rPr>
-        <w:t xml:space="preserve">nte en estado 'Recibida' según el flujo del </w:t>
+        <w:t xml:space="preserve"> La orden debe iniciar automáticamente en estado 'Recibida' según el flujo del </w:t>
       </w:r>
       <w:r>
         <w:rPr>
@@ -4306,7 +3958,14 @@
           <w:sz w:val="20"/>
           <w:szCs w:val="20"/>
         </w:rPr>
-        <w:t>Para catálogo (RF</w:t>
+        <w:t>Para catálogo (RF-06):</w:t>
+      </w:r>
+      <w:r>
+        <w:rPr>
+          <w:sz w:val="20"/>
+          <w:szCs w:val="20"/>
+        </w:rPr>
+        <w:t xml:space="preserve"> Si es un producto nuevo, solicitar Código/SKU, Nombre, Marca, Categoría, Precio de Venta y definir el </w:t>
       </w:r>
       <w:r>
         <w:rPr>
@@ -4315,14 +3974,14 @@
           <w:sz w:val="20"/>
           <w:szCs w:val="20"/>
         </w:rPr>
-        <w:t>-06):</w:t>
-      </w:r>
-      <w:r>
-        <w:rPr>
-          <w:sz w:val="20"/>
-          <w:szCs w:val="20"/>
-        </w:rPr>
-        <w:t xml:space="preserve"> Si es un producto nuevo, solicitar Código/SKU, Nombre, Marca, Categoría, Precio de Venta y definir el </w:t>
+        <w:t>Punto de Reorden</w:t>
+      </w:r>
+      <w:r>
+        <w:rPr>
+          <w:sz w:val="20"/>
+          <w:szCs w:val="20"/>
+        </w:rPr>
+        <w:t xml:space="preserve"> (Stock mínimo). * </w:t>
       </w:r>
       <w:r>
         <w:rPr>
@@ -4331,22 +3990,6 @@
           <w:sz w:val="20"/>
           <w:szCs w:val="20"/>
         </w:rPr>
-        <w:t>Punto de Reorden</w:t>
-      </w:r>
-      <w:r>
-        <w:rPr>
-          <w:sz w:val="20"/>
-          <w:szCs w:val="20"/>
-        </w:rPr>
-        <w:t xml:space="preserve"> (Stock mínimo). * </w:t>
-      </w:r>
-      <w:r>
-        <w:rPr>
-          <w:b/>
-          <w:bCs/>
-          <w:sz w:val="20"/>
-          <w:szCs w:val="20"/>
-        </w:rPr>
         <w:t>Para reabastecimiento (RF-20):</w:t>
       </w:r>
       <w:r>
@@ -4354,14 +3997,7 @@
           <w:sz w:val="20"/>
           <w:szCs w:val="20"/>
         </w:rPr>
-        <w:t xml:space="preserve"> Si es carga de stock existente, solicitar Proveedor, Número de Factura y Cantidade</w:t>
-      </w:r>
-      <w:r>
-        <w:rPr>
-          <w:sz w:val="20"/>
-          <w:szCs w:val="20"/>
-        </w:rPr>
-        <w:t xml:space="preserve">s recibidas. * </w:t>
+        <w:t xml:space="preserve"> Si es carga de stock existente, solicitar Proveedor, Número de Factura y Cantidades recibidas. * </w:t>
       </w:r>
       <w:r>
         <w:rPr>
@@ -4559,14 +4195,7 @@
           <w:sz w:val="20"/>
           <w:szCs w:val="20"/>
         </w:rPr>
-        <w:t xml:space="preserve"> Placa (validar como identificador único), Marca, Modelo/Año, Color, N</w:t>
-      </w:r>
-      <w:r>
-        <w:rPr>
-          <w:sz w:val="20"/>
-          <w:szCs w:val="20"/>
-        </w:rPr>
-        <w:t xml:space="preserve">úmero de Motor y Kilometraje actual. * </w:t>
+        <w:t xml:space="preserve"> Placa (validar como identificador único), Marca, Modelo/Año, Color, Número de Motor y Kilometraje actual. * </w:t>
       </w:r>
       <w:r>
         <w:rPr>
@@ -4667,14 +4296,7 @@
           <w:sz w:val="20"/>
           <w:szCs w:val="20"/>
         </w:rPr>
-        <w:t xml:space="preserve"> Deberías completar la frase para aclarar si los repuestos se descuentan del stock al momento de la solicitud o hasta la factura</w:t>
-      </w:r>
-      <w:r>
-        <w:rPr>
-          <w:sz w:val="20"/>
-          <w:szCs w:val="20"/>
-        </w:rPr>
-        <w:t>ción.</w:t>
+        <w:t xml:space="preserve"> Deberías completar la frase para aclarar si los repuestos se descuentan del stock al momento de la solicitud o hasta la facturación.</w:t>
       </w:r>
     </w:p>
     <w:p>
@@ -4750,14 +4372,7 @@
           <w:sz w:val="20"/>
           <w:szCs w:val="20"/>
         </w:rPr>
-        <w:t>) para que él pueda empezar a ver su estado por pla</w:t>
-      </w:r>
-      <w:r>
-        <w:rPr>
-          <w:sz w:val="20"/>
-          <w:szCs w:val="20"/>
-        </w:rPr>
-        <w:t>ca de inmediato.</w:t>
+        <w:t>) para que él pueda empezar a ver su estado por placa de inmediato.</w:t>
       </w:r>
     </w:p>
     <w:p>
@@ -4865,241 +4480,7 @@
           <w:sz w:val="20"/>
           <w:szCs w:val="20"/>
         </w:rPr>
-        <w:t xml:space="preserve">En </w:t>
-      </w:r>
-      <w:r>
-        <w:rPr>
-          <w:rFonts w:ascii="Arial" w:hAnsi="Arial" w:cs="Arial"/>
-          <w:color w:val="000000"/>
-          <w:sz w:val="20"/>
-          <w:szCs w:val="20"/>
-        </w:rPr>
-        <w:t>él</w:t>
-      </w:r>
-      <w:r>
-        <w:rPr>
-          <w:rFonts w:ascii="Arial" w:hAnsi="Arial" w:cs="Arial"/>
-          <w:color w:val="000000"/>
-          <w:sz w:val="20"/>
-          <w:szCs w:val="20"/>
-        </w:rPr>
-        <w:t xml:space="preserve"> la </w:t>
-      </w:r>
-      <w:r>
-        <w:rPr>
-          <w:rFonts w:ascii="Arial" w:hAnsi="Arial" w:cs="Arial"/>
-          <w:color w:val="000000"/>
-          <w:sz w:val="20"/>
-          <w:szCs w:val="20"/>
-        </w:rPr>
-        <w:t>página</w:t>
-      </w:r>
-      <w:r>
-        <w:rPr>
-          <w:rFonts w:ascii="Arial" w:hAnsi="Arial" w:cs="Arial"/>
-          <w:color w:val="000000"/>
-          <w:sz w:val="20"/>
-          <w:szCs w:val="20"/>
-        </w:rPr>
-        <w:t xml:space="preserve"> de inicio </w:t>
-      </w:r>
-      <w:r>
-        <w:rPr>
-          <w:rFonts w:ascii="Arial" w:hAnsi="Arial" w:cs="Arial"/>
-          <w:color w:val="000000"/>
-          <w:sz w:val="20"/>
-          <w:szCs w:val="20"/>
-        </w:rPr>
-        <w:t>principal</w:t>
-      </w:r>
-      <w:r>
-        <w:rPr>
-          <w:rFonts w:ascii="Arial" w:hAnsi="Arial" w:cs="Arial"/>
-          <w:color w:val="000000"/>
-          <w:sz w:val="20"/>
-          <w:szCs w:val="20"/>
-        </w:rPr>
-        <w:t xml:space="preserve"> en la parte de Opiniones de nuestros </w:t>
-      </w:r>
-      <w:r>
-        <w:rPr>
-          <w:rFonts w:ascii="Arial" w:hAnsi="Arial" w:cs="Arial"/>
-          <w:color w:val="000000"/>
-          <w:sz w:val="20"/>
-          <w:szCs w:val="20"/>
-        </w:rPr>
-        <w:t>clientes ahí</w:t>
-      </w:r>
-      <w:r>
-        <w:rPr>
-          <w:rFonts w:ascii="Arial" w:hAnsi="Arial" w:cs="Arial"/>
-          <w:color w:val="000000"/>
-          <w:sz w:val="20"/>
-          <w:szCs w:val="20"/>
-        </w:rPr>
-        <w:t xml:space="preserve"> un </w:t>
-      </w:r>
-      <w:r>
-        <w:rPr>
-          <w:rFonts w:ascii="Arial" w:hAnsi="Arial" w:cs="Arial"/>
-          <w:color w:val="000000"/>
-          <w:sz w:val="20"/>
-          <w:szCs w:val="20"/>
-        </w:rPr>
-        <w:t>menú</w:t>
-      </w:r>
-      <w:r>
-        <w:rPr>
-          <w:rFonts w:ascii="Arial" w:hAnsi="Arial" w:cs="Arial"/>
-          <w:color w:val="000000"/>
-          <w:sz w:val="20"/>
-          <w:szCs w:val="20"/>
-        </w:rPr>
-        <w:t xml:space="preserve"> que dice "Deja tu reseña" eso quiero que lo quietes de </w:t>
-      </w:r>
-      <w:r>
-        <w:rPr>
-          <w:rFonts w:ascii="Arial" w:hAnsi="Arial" w:cs="Arial"/>
-          <w:color w:val="000000"/>
-          <w:sz w:val="20"/>
-          <w:szCs w:val="20"/>
-        </w:rPr>
-        <w:t>ahí</w:t>
-      </w:r>
-      <w:r>
-        <w:rPr>
-          <w:rFonts w:ascii="Arial" w:hAnsi="Arial" w:cs="Arial"/>
-          <w:color w:val="000000"/>
-          <w:sz w:val="20"/>
-          <w:szCs w:val="20"/>
-        </w:rPr>
-        <w:t xml:space="preserve"> y lo pongas en el rol de cliente y que </w:t>
-      </w:r>
-      <w:r>
-        <w:rPr>
-          <w:rFonts w:ascii="Arial" w:hAnsi="Arial" w:cs="Arial"/>
-          <w:color w:val="000000"/>
-          <w:sz w:val="20"/>
-          <w:szCs w:val="20"/>
-        </w:rPr>
-        <w:t>él</w:t>
-      </w:r>
-      <w:r>
-        <w:rPr>
-          <w:rFonts w:ascii="Arial" w:hAnsi="Arial" w:cs="Arial"/>
-          <w:color w:val="000000"/>
-          <w:sz w:val="20"/>
-          <w:szCs w:val="20"/>
-        </w:rPr>
-        <w:t xml:space="preserve"> pueda calificar el servicio recibido y que </w:t>
-      </w:r>
-      <w:r>
-        <w:rPr>
-          <w:rFonts w:ascii="Arial" w:hAnsi="Arial" w:cs="Arial"/>
-          <w:color w:val="000000"/>
-          <w:sz w:val="20"/>
-          <w:szCs w:val="20"/>
-        </w:rPr>
-        <w:t>automáticamente</w:t>
-      </w:r>
-      <w:r>
-        <w:rPr>
-          <w:rFonts w:ascii="Arial" w:hAnsi="Arial" w:cs="Arial"/>
-          <w:color w:val="000000"/>
-          <w:sz w:val="20"/>
-          <w:szCs w:val="20"/>
-        </w:rPr>
-        <w:t xml:space="preserve"> aparezca su reseña en la </w:t>
-      </w:r>
-      <w:r>
-        <w:rPr>
-          <w:rFonts w:ascii="Arial" w:hAnsi="Arial" w:cs="Arial"/>
-          <w:color w:val="000000"/>
-          <w:sz w:val="20"/>
-          <w:szCs w:val="20"/>
-        </w:rPr>
-        <w:t>página</w:t>
-      </w:r>
-      <w:r>
-        <w:rPr>
-          <w:rFonts w:ascii="Arial" w:hAnsi="Arial" w:cs="Arial"/>
-          <w:color w:val="000000"/>
-          <w:sz w:val="20"/>
-          <w:szCs w:val="20"/>
-        </w:rPr>
-        <w:t xml:space="preserve"> de </w:t>
-      </w:r>
-      <w:r>
-        <w:rPr>
-          <w:rFonts w:ascii="Arial" w:hAnsi="Arial" w:cs="Arial"/>
-          <w:color w:val="000000"/>
-          <w:sz w:val="20"/>
-          <w:szCs w:val="20"/>
-        </w:rPr>
-        <w:t>inicio,</w:t>
-      </w:r>
-      <w:r>
-        <w:rPr>
-          <w:rFonts w:ascii="Arial" w:hAnsi="Arial" w:cs="Arial"/>
-          <w:color w:val="000000"/>
-          <w:sz w:val="20"/>
-          <w:szCs w:val="20"/>
-        </w:rPr>
-        <w:t xml:space="preserve"> pero en </w:t>
-      </w:r>
-      <w:r>
-        <w:rPr>
-          <w:rFonts w:ascii="Arial" w:hAnsi="Arial" w:cs="Arial"/>
-          <w:color w:val="000000"/>
-          <w:sz w:val="20"/>
-          <w:szCs w:val="20"/>
-        </w:rPr>
-        <w:t>sí</w:t>
-      </w:r>
-      <w:r>
-        <w:rPr>
-          <w:rFonts w:ascii="Arial" w:hAnsi="Arial" w:cs="Arial"/>
-          <w:color w:val="000000"/>
-          <w:sz w:val="20"/>
-          <w:szCs w:val="20"/>
-        </w:rPr>
-        <w:t xml:space="preserve"> que solamente en la </w:t>
-      </w:r>
-      <w:r>
-        <w:rPr>
-          <w:rFonts w:ascii="Arial" w:hAnsi="Arial" w:cs="Arial"/>
-          <w:color w:val="000000"/>
-          <w:sz w:val="20"/>
-          <w:szCs w:val="20"/>
-        </w:rPr>
-        <w:t>página</w:t>
-      </w:r>
-      <w:r>
-        <w:rPr>
-          <w:rFonts w:ascii="Arial" w:hAnsi="Arial" w:cs="Arial"/>
-          <w:color w:val="000000"/>
-          <w:sz w:val="20"/>
-          <w:szCs w:val="20"/>
-        </w:rPr>
-        <w:t xml:space="preserve"> </w:t>
-      </w:r>
-      <w:r>
-        <w:rPr>
-          <w:rFonts w:ascii="Arial" w:hAnsi="Arial" w:cs="Arial"/>
-          <w:color w:val="000000"/>
-          <w:sz w:val="20"/>
-          <w:szCs w:val="20"/>
-        </w:rPr>
-        <w:t>principal</w:t>
-      </w:r>
-      <w:r>
-        <w:rPr>
-          <w:rFonts w:ascii="Arial" w:hAnsi="Arial" w:cs="Arial"/>
-          <w:color w:val="000000"/>
-          <w:sz w:val="20"/>
-          <w:szCs w:val="20"/>
-        </w:rPr>
-        <w:t xml:space="preserve"> aparezca reseñas recientes.</w:t>
+        <w:t>En él la página de inicio principal en la parte de Opiniones de nuestros clientes ahí un menú que dice "Deja tu reseña" eso quiero que lo quietes de ahí y lo pongas en el rol de cliente y que él pueda calificar el servicio recibido y que automáticamente aparezca su reseña en la página de inicio, pero en sí que solamente en la página principal aparezca reseñas recientes.</w:t>
       </w:r>
     </w:p>
     <w:p>
@@ -5123,259 +4504,7 @@
           <w:sz w:val="20"/>
           <w:szCs w:val="20"/>
         </w:rPr>
-        <w:t>también</w:t>
-      </w:r>
-      <w:r>
-        <w:rPr>
-          <w:rFonts w:ascii="Arial" w:hAnsi="Arial" w:cs="Arial"/>
-          <w:color w:val="000000"/>
-          <w:sz w:val="20"/>
-          <w:szCs w:val="20"/>
-        </w:rPr>
-        <w:t xml:space="preserve"> en el rol</w:t>
-      </w:r>
-      <w:r>
-        <w:rPr>
-          <w:rFonts w:ascii="Arial" w:hAnsi="Arial" w:cs="Arial"/>
-          <w:color w:val="000000"/>
-          <w:sz w:val="20"/>
-          <w:szCs w:val="20"/>
-        </w:rPr>
-        <w:t xml:space="preserve"> </w:t>
-      </w:r>
-      <w:r>
-        <w:rPr>
-          <w:rFonts w:ascii="Arial" w:hAnsi="Arial" w:cs="Arial"/>
-          <w:color w:val="000000"/>
-          <w:sz w:val="20"/>
-          <w:szCs w:val="20"/>
-        </w:rPr>
-        <w:t xml:space="preserve">de </w:t>
-      </w:r>
-      <w:r>
-        <w:rPr>
-          <w:rFonts w:ascii="Arial" w:hAnsi="Arial" w:cs="Arial"/>
-          <w:color w:val="000000"/>
-          <w:sz w:val="20"/>
-          <w:szCs w:val="20"/>
-        </w:rPr>
-        <w:t>administrador</w:t>
-      </w:r>
-      <w:r>
-        <w:rPr>
-          <w:rFonts w:ascii="Arial" w:hAnsi="Arial" w:cs="Arial"/>
-          <w:color w:val="000000"/>
-          <w:sz w:val="20"/>
-          <w:szCs w:val="20"/>
-        </w:rPr>
-        <w:t xml:space="preserve"> en la parte de </w:t>
-      </w:r>
-      <w:r>
-        <w:rPr>
-          <w:rFonts w:ascii="Arial" w:hAnsi="Arial" w:cs="Arial"/>
-          <w:color w:val="000000"/>
-          <w:sz w:val="20"/>
-          <w:szCs w:val="20"/>
-        </w:rPr>
-        <w:t>gestión</w:t>
-      </w:r>
-      <w:r>
-        <w:rPr>
-          <w:rFonts w:ascii="Arial" w:hAnsi="Arial" w:cs="Arial"/>
-          <w:color w:val="000000"/>
-          <w:sz w:val="20"/>
-          <w:szCs w:val="20"/>
-        </w:rPr>
-        <w:t xml:space="preserve"> </w:t>
-      </w:r>
-      <w:r>
-        <w:rPr>
-          <w:rFonts w:ascii="Arial" w:hAnsi="Arial" w:cs="Arial"/>
-          <w:color w:val="000000"/>
-          <w:sz w:val="20"/>
-          <w:szCs w:val="20"/>
-        </w:rPr>
-        <w:t>ahí</w:t>
-      </w:r>
-      <w:r>
-        <w:rPr>
-          <w:rFonts w:ascii="Arial" w:hAnsi="Arial" w:cs="Arial"/>
-          <w:color w:val="000000"/>
-          <w:sz w:val="20"/>
-          <w:szCs w:val="20"/>
-        </w:rPr>
-        <w:t xml:space="preserve"> una </w:t>
-      </w:r>
-      <w:r>
-        <w:rPr>
-          <w:rFonts w:ascii="Arial" w:hAnsi="Arial" w:cs="Arial"/>
-          <w:color w:val="000000"/>
-          <w:sz w:val="20"/>
-          <w:szCs w:val="20"/>
-        </w:rPr>
-        <w:t>opción</w:t>
-      </w:r>
-      <w:r>
-        <w:rPr>
-          <w:rFonts w:ascii="Arial" w:hAnsi="Arial" w:cs="Arial"/>
-          <w:color w:val="000000"/>
-          <w:sz w:val="20"/>
-          <w:szCs w:val="20"/>
-        </w:rPr>
-        <w:t xml:space="preserve"> llamada "calificaciones y opiniones" eso debe actualizarse con </w:t>
-      </w:r>
-      <w:r>
-        <w:rPr>
-          <w:rFonts w:ascii="Arial" w:hAnsi="Arial" w:cs="Arial"/>
-          <w:color w:val="000000"/>
-          <w:sz w:val="20"/>
-          <w:szCs w:val="20"/>
-        </w:rPr>
-        <w:t>las reseñas</w:t>
-      </w:r>
-      <w:r>
-        <w:rPr>
-          <w:rFonts w:ascii="Arial" w:hAnsi="Arial" w:cs="Arial"/>
-          <w:color w:val="000000"/>
-          <w:sz w:val="20"/>
-          <w:szCs w:val="20"/>
-        </w:rPr>
-        <w:t xml:space="preserve"> de los clientes que vaya enlazado y que </w:t>
-      </w:r>
-      <w:r>
-        <w:rPr>
-          <w:rFonts w:ascii="Arial" w:hAnsi="Arial" w:cs="Arial"/>
-          <w:color w:val="000000"/>
-          <w:sz w:val="20"/>
-          <w:szCs w:val="20"/>
-        </w:rPr>
-        <w:t>también</w:t>
-      </w:r>
-      <w:r>
-        <w:rPr>
-          <w:rFonts w:ascii="Arial" w:hAnsi="Arial" w:cs="Arial"/>
-          <w:color w:val="000000"/>
-          <w:sz w:val="20"/>
-          <w:szCs w:val="20"/>
-        </w:rPr>
-        <w:t xml:space="preserve"> salga como calificaron al taller y al </w:t>
-      </w:r>
-      <w:r>
-        <w:rPr>
-          <w:rFonts w:ascii="Arial" w:hAnsi="Arial" w:cs="Arial"/>
-          <w:color w:val="000000"/>
-          <w:sz w:val="20"/>
-          <w:szCs w:val="20"/>
-        </w:rPr>
-        <w:t>mecánico</w:t>
-      </w:r>
-      <w:r>
-        <w:rPr>
-          <w:rFonts w:ascii="Arial" w:hAnsi="Arial" w:cs="Arial"/>
-          <w:color w:val="000000"/>
-          <w:sz w:val="20"/>
-          <w:szCs w:val="20"/>
-        </w:rPr>
-        <w:t xml:space="preserve">, </w:t>
-      </w:r>
-      <w:r>
-        <w:rPr>
-          <w:rFonts w:ascii="Arial" w:hAnsi="Arial" w:cs="Arial"/>
-          <w:color w:val="000000"/>
-          <w:sz w:val="20"/>
-          <w:szCs w:val="20"/>
-        </w:rPr>
-        <w:t>también</w:t>
-      </w:r>
-      <w:r>
-        <w:rPr>
-          <w:rFonts w:ascii="Arial" w:hAnsi="Arial" w:cs="Arial"/>
-          <w:color w:val="000000"/>
-          <w:sz w:val="20"/>
-          <w:szCs w:val="20"/>
-        </w:rPr>
-        <w:t xml:space="preserve"> agrega como un apartado donde se pueda ver el perfil del </w:t>
-      </w:r>
-      <w:r>
-        <w:rPr>
-          <w:rFonts w:ascii="Arial" w:hAnsi="Arial" w:cs="Arial"/>
-          <w:color w:val="000000"/>
-          <w:sz w:val="20"/>
-          <w:szCs w:val="20"/>
-        </w:rPr>
-        <w:t>mecánico</w:t>
-      </w:r>
-      <w:r>
-        <w:rPr>
-          <w:rFonts w:ascii="Arial" w:hAnsi="Arial" w:cs="Arial"/>
-          <w:color w:val="000000"/>
-          <w:sz w:val="20"/>
-          <w:szCs w:val="20"/>
-        </w:rPr>
-        <w:t xml:space="preserve"> y sus vistos buenos, las reseñas de los clientes que </w:t>
-      </w:r>
-      <w:r>
-        <w:rPr>
-          <w:rFonts w:ascii="Arial" w:hAnsi="Arial" w:cs="Arial"/>
-          <w:color w:val="000000"/>
-          <w:sz w:val="20"/>
-          <w:szCs w:val="20"/>
-        </w:rPr>
-        <w:t>atendió,</w:t>
-      </w:r>
-      <w:r>
-        <w:rPr>
-          <w:rFonts w:ascii="Arial" w:hAnsi="Arial" w:cs="Arial"/>
-          <w:color w:val="000000"/>
-          <w:sz w:val="20"/>
-          <w:szCs w:val="20"/>
-        </w:rPr>
-        <w:t xml:space="preserve"> y </w:t>
-      </w:r>
-      <w:r>
-        <w:rPr>
-          <w:rFonts w:ascii="Arial" w:hAnsi="Arial" w:cs="Arial"/>
-          <w:color w:val="000000"/>
-          <w:sz w:val="20"/>
-          <w:szCs w:val="20"/>
-        </w:rPr>
-        <w:t>así</w:t>
-      </w:r>
-      <w:r>
-        <w:rPr>
-          <w:rFonts w:ascii="Arial" w:hAnsi="Arial" w:cs="Arial"/>
-          <w:color w:val="000000"/>
-          <w:sz w:val="20"/>
-          <w:szCs w:val="20"/>
-        </w:rPr>
-        <w:t xml:space="preserve"> se ve que </w:t>
-      </w:r>
-      <w:r>
-        <w:rPr>
-          <w:rFonts w:ascii="Arial" w:hAnsi="Arial" w:cs="Arial"/>
-          <w:color w:val="000000"/>
-          <w:sz w:val="20"/>
-          <w:szCs w:val="20"/>
-        </w:rPr>
-        <w:t>mecánico</w:t>
-      </w:r>
-      <w:r>
-        <w:rPr>
-          <w:rFonts w:ascii="Arial" w:hAnsi="Arial" w:cs="Arial"/>
-          <w:color w:val="000000"/>
-          <w:sz w:val="20"/>
-          <w:szCs w:val="20"/>
-        </w:rPr>
-        <w:t xml:space="preserve"> es bueno y da mejores rendimientos y resultados</w:t>
-      </w:r>
-      <w:r>
-        <w:rPr>
-          <w:rFonts w:ascii="Arial" w:hAnsi="Arial" w:cs="Arial"/>
-          <w:color w:val="000000"/>
-          <w:sz w:val="20"/>
-          <w:szCs w:val="20"/>
-        </w:rPr>
-        <w:t>.</w:t>
+        <w:t>también en el rol de administrador en la parte de gestión ahí una opción llamada "calificaciones y opiniones" eso debe actualizarse con las reseñas de los clientes que vaya enlazado y que también salga como calificaron al taller y al mecánico, también agrega como un apartado donde se pueda ver el perfil del mecánico y sus vistos buenos, las reseñas de los clientes que atendió, y así se ve que mecánico es bueno y da mejores rendimientos y resultados.</w:t>
       </w:r>
     </w:p>
     <w:p>
@@ -5431,9 +4560,13 @@
           <w:sz w:val="36"/>
           <w:szCs w:val="36"/>
         </w:rPr>
-        <w:t xml:space="preserve"> FALTA</w:t>
-      </w:r>
-      <w:r>
+        <w:t xml:space="preserve"> </w:t>
+      </w:r>
+    </w:p>
+    <w:p>
+      <w:pPr>
+        <w:pStyle w:val="NormalWeb"/>
+        <w:spacing w:before="240" w:beforeAutospacing="0" w:after="240" w:afterAutospacing="0"/>
         <w:rPr>
           <w:rFonts w:ascii="Arial" w:hAnsi="Arial" w:cs="Arial"/>
           <w:b/>
@@ -5444,8 +4577,7 @@
           <w:sz w:val="36"/>
           <w:szCs w:val="36"/>
         </w:rPr>
-        <w:t>N</w:t>
-      </w:r>
+      </w:pPr>
       <w:r>
         <w:rPr>
           <w:rFonts w:ascii="Arial" w:hAnsi="Arial" w:cs="Arial"/>
@@ -5457,7 +4589,7 @@
           <w:sz w:val="36"/>
           <w:szCs w:val="36"/>
         </w:rPr>
-        <w:t xml:space="preserve"> POR HACER</w:t>
+        <w:t>EJECUTADO EL 13/03/2026</w:t>
       </w:r>
     </w:p>
     <w:p>
@@ -6202,6 +5334,7 @@
           <w:szCs w:val="20"/>
           <w:lang w:val="es-CO"/>
         </w:rPr>
+        <w:lastRenderedPageBreak/>
         <w:t xml:space="preserve">Dentro del perfil del cliente debe existir una sección llamada </w:t>
       </w:r>
       <w:r>
@@ -6270,7 +5403,6 @@
           <w:szCs w:val="20"/>
           <w:lang w:val="es-CO"/>
         </w:rPr>
-        <w:lastRenderedPageBreak/>
         <w:t>Historial de puntos ganados</w:t>
       </w:r>
     </w:p>
@@ -6659,11 +5791,28 @@
         <w:spacing w:before="240" w:beforeAutospacing="0" w:after="240" w:afterAutospacing="0"/>
         <w:rPr>
           <w:rFonts w:ascii="Arial" w:hAnsi="Arial" w:cs="Arial"/>
+          <w:b/>
+          <w:bCs/>
+          <w:i/>
+          <w:iCs/>
           <w:color w:val="000000"/>
-          <w:sz w:val="20"/>
-          <w:szCs w:val="20"/>
-        </w:rPr>
-      </w:pPr>
+          <w:sz w:val="36"/>
+          <w:szCs w:val="36"/>
+        </w:rPr>
+      </w:pPr>
+      <w:r>
+        <w:rPr>
+          <w:rFonts w:ascii="Arial" w:hAnsi="Arial" w:cs="Arial"/>
+          <w:b/>
+          <w:bCs/>
+          <w:i/>
+          <w:iCs/>
+          <w:color w:val="000000"/>
+          <w:sz w:val="36"/>
+          <w:szCs w:val="36"/>
+        </w:rPr>
+        <w:t>PROMPT 12/03/2026 FALTAN POR HACER</w:t>
+      </w:r>
     </w:p>
     <w:p>
       <w:pPr>
@@ -6671,6 +5820,18 @@
         <w:spacing w:before="240" w:beforeAutospacing="0" w:after="240" w:afterAutospacing="0"/>
         <w:rPr>
           <w:rFonts w:ascii="Arial" w:hAnsi="Arial" w:cs="Arial"/>
+          <w:color w:val="000000"/>
+          <w:sz w:val="20"/>
+          <w:szCs w:val="20"/>
+        </w:rPr>
+      </w:pPr>
+    </w:p>
+    <w:p>
+      <w:pPr>
+        <w:pStyle w:val="NormalWeb"/>
+        <w:spacing w:before="240" w:beforeAutospacing="0" w:after="240" w:afterAutospacing="0"/>
+        <w:rPr>
+          <w:rFonts w:ascii="Arial" w:hAnsi="Arial" w:cs="Arial"/>
           <w:sz w:val="20"/>
           <w:szCs w:val="20"/>
         </w:rPr>
@@ -6699,15 +5860,7 @@
           <w:sz w:val="20"/>
           <w:szCs w:val="20"/>
         </w:rPr>
-        <w:t>,</w:t>
-      </w:r>
-      <w:r>
-        <w:rPr>
-          <w:rFonts w:ascii="Arial" w:hAnsi="Arial" w:cs="Arial"/>
-          <w:sz w:val="20"/>
-          <w:szCs w:val="20"/>
-        </w:rPr>
-        <w:t xml:space="preserve"> de la página principal</w:t>
+        <w:t>, de la página principal</w:t>
       </w:r>
       <w:r>
         <w:rPr>
@@ -7352,6 +6505,7 @@
           <w:szCs w:val="20"/>
           <w:lang w:val="es-CO"/>
         </w:rPr>
+        <w:lastRenderedPageBreak/>
         <w:t>Las imágenes deben representar claramente cada concepto:</w:t>
       </w:r>
     </w:p>
@@ -7493,7 +6647,6 @@
           <w:szCs w:val="20"/>
           <w:lang w:val="es-CO"/>
         </w:rPr>
-        <w:lastRenderedPageBreak/>
         <w:t>Objetivo final:</w:t>
       </w:r>
       <w:r>
@@ -7556,7 +6709,25 @@
           <w:sz w:val="20"/>
           <w:szCs w:val="20"/>
         </w:rPr>
-        <w:t xml:space="preserve">PROMPT PARA Seccion </w:t>
+        <w:t xml:space="preserve">PROMPT PARA </w:t>
+      </w:r>
+      <w:proofErr w:type="spellStart"/>
+      <w:r>
+        <w:rPr>
+          <w:rFonts w:ascii="Arial" w:hAnsi="Arial" w:cs="Arial"/>
+          <w:sz w:val="20"/>
+          <w:szCs w:val="20"/>
+        </w:rPr>
+        <w:t>Seccion</w:t>
+      </w:r>
+      <w:proofErr w:type="spellEnd"/>
+      <w:r>
+        <w:rPr>
+          <w:rFonts w:ascii="Arial" w:hAnsi="Arial" w:cs="Arial"/>
+          <w:sz w:val="20"/>
+          <w:szCs w:val="20"/>
+        </w:rPr>
+        <w:t xml:space="preserve"> </w:t>
       </w:r>
       <w:r>
         <w:rPr>
@@ -8404,6 +7575,7 @@
           <w:sz w:val="20"/>
           <w:szCs w:val="20"/>
         </w:rPr>
+        <w:lastRenderedPageBreak/>
         <w:t xml:space="preserve">El botón debe </w:t>
       </w:r>
       <w:r>
@@ -8476,7 +7648,6 @@
           <w:sz w:val="20"/>
           <w:szCs w:val="20"/>
         </w:rPr>
-        <w:lastRenderedPageBreak/>
         <w:t>Objetivo del rediseño</w:t>
       </w:r>
     </w:p>
@@ -8701,13 +7872,6 @@
           <w:szCs w:val="20"/>
         </w:rPr>
         <w:br/>
-      </w:r>
-      <w:r>
-        <w:rPr>
-          <w:rFonts w:ascii="Arial" w:hAnsi="Arial" w:cs="Arial"/>
-          <w:sz w:val="20"/>
-          <w:szCs w:val="20"/>
-        </w:rPr>
         <w:t xml:space="preserve">Rediseña la sección actual llamada </w:t>
       </w:r>
       <w:r>
@@ -9273,6 +8437,7 @@
           <w:sz w:val="20"/>
           <w:szCs w:val="20"/>
         </w:rPr>
+        <w:lastRenderedPageBreak/>
         <w:pict w14:anchorId="66BF900B">
           <v:rect id="_x0000_i1026" style="width:0;height:1.5pt" o:hralign="center" o:hrstd="t" o:hr="t" fillcolor="#a0a0a0" stroked="f"/>
         </w:pict>
@@ -9291,7 +8456,6 @@
           <w:sz w:val="20"/>
           <w:szCs w:val="20"/>
         </w:rPr>
-        <w:lastRenderedPageBreak/>
         <w:t>Objetivo de la Pantalla</w:t>
       </w:r>
     </w:p>
@@ -10034,6 +9198,7 @@
           <w:sz w:val="20"/>
           <w:szCs w:val="20"/>
         </w:rPr>
+        <w:lastRenderedPageBreak/>
         <w:t>precio</w:t>
       </w:r>
     </w:p>
@@ -10074,7 +9239,6 @@
           <w:sz w:val="20"/>
           <w:szCs w:val="20"/>
         </w:rPr>
-        <w:lastRenderedPageBreak/>
         <w:t xml:space="preserve">Debe mantener el </w:t>
       </w:r>
       <w:r>
@@ -10729,6 +9893,7 @@
           <w:sz w:val="20"/>
           <w:szCs w:val="20"/>
         </w:rPr>
+        <w:lastRenderedPageBreak/>
         <w:pict w14:anchorId="24BB87D6">
           <v:rect id="_x0000_i1033" style="width:0;height:1.5pt" o:hralign="center" o:hrstd="t" o:hr="t" fillcolor="#a0a0a0" stroked="f"/>
         </w:pict>
@@ -10747,7 +9912,6 @@
           <w:sz w:val="20"/>
           <w:szCs w:val="20"/>
         </w:rPr>
-        <w:lastRenderedPageBreak/>
         <w:t>Sección de Acciones</w:t>
       </w:r>
     </w:p>

</xml_diff>